<commit_message>
Strengthen Chapter 26 with Dave Barger details from source screenshot
- Establish Diabetes Dave's full name as Dave Barger at his introduction
- Tighten the Barger genealogy payoff now that the surname connection is explicit
- Add the loyalty beat documented in the iMessage screenshot: Rob took a formal FMLA leave at Novo for Lou's health, and Dave vouched for him to the company
</commit_message>
<xml_diff>
--- a/The Cardinals Promise - draft 4.13.2026.docx
+++ b/The Cardinals Promise - draft 4.13.2026.docx
@@ -3578,7 +3578,7 @@
         <w:spacing w:line="276" w:lineRule="auto"/>
       </w:pPr>
       <w:r>
-        <w:t>They called him Diabetes Dave in Panama City. Not behind his back — to his face. Because he'd been doing what he does for so long and he's just that good at it. He doesn't even go to the front door. He goes to the back door. Everyone knows him. High character. Strong Christian. Just an all-around good person. Dave was my mentor. He was honing me in on what to look for, making sure I checked the boxes. He took the time.</w:t>
+        <w:t>His name is Dave Barger. In Panama City they call him Diabetes Dave — not behind his back, to his face — because he'd been doing what he does for so long and he's just that good at it. He doesn't even go to the front door. He goes to the back door. Everyone knows him. High character. Strong Christian. Just an all-around good person. Dave was my mentor. He was honing me in on what to look for, making sure I checked the boxes. He took the time.</w:t>
       </w:r>
     </w:p>
     <w:p>
@@ -3610,7 +3610,15 @@
         <w:spacing w:line="276" w:lineRule="auto"/>
       </w:pPr>
       <w:r>
-        <w:t>It was Hope's mother Rhonda who discovered the connection. Her maiden name was Barger. When she found Dave's name in the genealogy records — five generations back, distant but documented — I sat staring at the family tree on her computer screen. Of all the people at Novo Nordisk, I'd found family. And that family member had taught me how to recognize a sign when it arrived. I didn't know that on Christmas Day 2025 I would lose Lou. I didn't know that on January 9, 2026 — exactly seventeen years after I got sober — a cardinal would appear. But when it did, I would recognize it. Because Dave had taught me the language.</w:t>
+        <w:t>It was Hope's mother Rhonda who discovered the connection. Her maiden name was Barger — the same name as Dave. I'd thought nothing of it; Barger is just a name. Then Rhonda started digging, and there he was. When she found Dave Barger in the genealogy records — five generations back, distant but documented — I sat staring at the family tree on her computer screen. Of all the people at Novo Nordisk, I'd been mentored by a man who turned out to be family. And that family member had taught me how to recognize a sign when it arrived. I didn't know that on Christmas Day 2025 I would lose Lou. I didn't know that on January 9, 2026 — exactly seventeen years after I got sober — a cardinal would appear. But when it did, I would recognize it. Because Dave had taught me the language.</w:t>
+      </w:r>
+    </w:p>
+    <w:p>
+      <w:pPr>
+        <w:spacing w:line="276" w:lineRule="auto"/>
+      </w:pPr>
+      <w:r>
+        <w:t>There's one more thing about Dave that no genealogy chart could show, but I lived it. When Lou's health started going, I took a formal leave from Novo to be available for my dad — FMLA, a real leave of absence, papers and all. I didn't make an announcement of it. Dave knew, because Dave was the person you told things to. And when word got around the company and someone started asking why I'd been out, it was Dave who answered for them — yes, he took some leave for his dad and his health; didn't I tell you about his dad? He said it the way you say it about family, not a coworker. He wasn't covering for a sales rep. He was looking out for a Barger. That's what the genealogy had been trying to tell me all along.</w:t>
       </w:r>
     </w:p>
     <w:p>

</xml_diff>